<commit_message>
Drop answer key from Word blanks, keep it behind --with-key flag
Co-Authored-By: Claude Opus 5 <noreply@anthropic.com>
Claude-Session: https://claude.ai/code/session_01THPYtTxM1qvoH53rMsouF9
</commit_message>
<xml_diff>
--- a/exam/docx/Экзамен_Вариант-01.docx
+++ b/exam/docx/Экзамен_Вариант-01.docx
@@ -1975,494 +1975,6 @@
           <w:szCs w:val="17"/>
         </w:rPr>
         <w:t xml:space="preserve">на первой встрече, до любых договорённостей</w:t>
-      </w:r>
-    </w:p>
-    <w:p>
-      <w:r>
-        <w:br w:type="page"/>
-      </w:r>
-    </w:p>
-    <w:p>
-      <w:pPr>
-        <w:spacing w:after="40"/>
-      </w:pPr>
-      <w:r>
-        <w:rPr>
-          <w:rFonts w:ascii="Georgia" w:cs="Georgia" w:eastAsia="Georgia" w:hAnsi="Georgia"/>
-          <w:color w:val="1C1A17"/>
-          <w:sz w:val="30"/>
-          <w:szCs w:val="30"/>
-        </w:rPr>
-        <w:t xml:space="preserve">Ключ ответов</w:t>
-      </w:r>
-    </w:p>
-    <w:p>
-      <w:pPr>
-        <w:pBdr>
-          <w:bottom w:val="single" w:color="DDD8CF" w:sz="4" w:space="4"/>
-        </w:pBdr>
-        <w:spacing w:after="240"/>
-      </w:pPr>
-      <w:r>
-        <w:rPr>
-          <w:rFonts w:ascii="Arial" w:cs="Arial" w:eastAsia="Arial" w:hAnsi="Arial"/>
-          <w:color w:val="8A7F6D"/>
-          <w:spacing w:val="30"/>
-          <w:sz w:val="13"/>
-          <w:szCs w:val="13"/>
-        </w:rPr>
-        <w:t xml:space="preserve">ВАРИАНТ 1 · ДЛЯ ПРЕПОДАВАТЕЛЯ</w:t>
-      </w:r>
-    </w:p>
-    <w:p>
-      <w:pPr>
-        <w:tabs>
-          <w:tab w:val="right" w:pos="1400"/>
-        </w:tabs>
-        <w:spacing w:after="20"/>
-      </w:pPr>
-      <w:r>
-        <w:rPr>
-          <w:rFonts w:ascii="Arial" w:cs="Arial" w:eastAsia="Arial" w:hAnsi="Arial"/>
-          <w:color w:val="6F6A62"/>
-          <w:sz w:val="18"/>
-          <w:szCs w:val="18"/>
-        </w:rPr>
-        <w:t xml:space="preserve">1</w:t>
-      </w:r>
-      <w:r>
-        <w:rPr>
-          <w:rFonts w:ascii="Arial" w:cs="Arial" w:eastAsia="Arial" w:hAnsi="Arial"/>
-          <w:b/>
-          <w:bCs/>
-          <w:color w:val="1C1A17"/>
-          <w:sz w:val="18"/>
-          <w:szCs w:val="18"/>
-        </w:rPr>
-        <w:tab/>
-        <w:t xml:space="preserve">Б</w:t>
-      </w:r>
-    </w:p>
-    <w:p>
-      <w:pPr>
-        <w:tabs>
-          <w:tab w:val="right" w:pos="1400"/>
-        </w:tabs>
-        <w:spacing w:after="20"/>
-      </w:pPr>
-      <w:r>
-        <w:rPr>
-          <w:rFonts w:ascii="Arial" w:cs="Arial" w:eastAsia="Arial" w:hAnsi="Arial"/>
-          <w:color w:val="6F6A62"/>
-          <w:sz w:val="18"/>
-          <w:szCs w:val="18"/>
-        </w:rPr>
-        <w:t xml:space="preserve">2</w:t>
-      </w:r>
-      <w:r>
-        <w:rPr>
-          <w:rFonts w:ascii="Arial" w:cs="Arial" w:eastAsia="Arial" w:hAnsi="Arial"/>
-          <w:b/>
-          <w:bCs/>
-          <w:color w:val="1C1A17"/>
-          <w:sz w:val="18"/>
-          <w:szCs w:val="18"/>
-        </w:rPr>
-        <w:tab/>
-        <w:t xml:space="preserve">В</w:t>
-      </w:r>
-    </w:p>
-    <w:p>
-      <w:pPr>
-        <w:tabs>
-          <w:tab w:val="right" w:pos="1400"/>
-        </w:tabs>
-        <w:spacing w:after="20"/>
-      </w:pPr>
-      <w:r>
-        <w:rPr>
-          <w:rFonts w:ascii="Arial" w:cs="Arial" w:eastAsia="Arial" w:hAnsi="Arial"/>
-          <w:color w:val="6F6A62"/>
-          <w:sz w:val="18"/>
-          <w:szCs w:val="18"/>
-        </w:rPr>
-        <w:t xml:space="preserve">3</w:t>
-      </w:r>
-      <w:r>
-        <w:rPr>
-          <w:rFonts w:ascii="Arial" w:cs="Arial" w:eastAsia="Arial" w:hAnsi="Arial"/>
-          <w:b/>
-          <w:bCs/>
-          <w:color w:val="1C1A17"/>
-          <w:sz w:val="18"/>
-          <w:szCs w:val="18"/>
-        </w:rPr>
-        <w:tab/>
-        <w:t xml:space="preserve">А</w:t>
-      </w:r>
-    </w:p>
-    <w:p>
-      <w:pPr>
-        <w:tabs>
-          <w:tab w:val="right" w:pos="1400"/>
-        </w:tabs>
-        <w:spacing w:after="20"/>
-      </w:pPr>
-      <w:r>
-        <w:rPr>
-          <w:rFonts w:ascii="Arial" w:cs="Arial" w:eastAsia="Arial" w:hAnsi="Arial"/>
-          <w:color w:val="6F6A62"/>
-          <w:sz w:val="18"/>
-          <w:szCs w:val="18"/>
-        </w:rPr>
-        <w:t xml:space="preserve">4</w:t>
-      </w:r>
-      <w:r>
-        <w:rPr>
-          <w:rFonts w:ascii="Arial" w:cs="Arial" w:eastAsia="Arial" w:hAnsi="Arial"/>
-          <w:b/>
-          <w:bCs/>
-          <w:color w:val="1C1A17"/>
-          <w:sz w:val="18"/>
-          <w:szCs w:val="18"/>
-        </w:rPr>
-        <w:tab/>
-        <w:t xml:space="preserve">Б</w:t>
-      </w:r>
-    </w:p>
-    <w:p>
-      <w:pPr>
-        <w:tabs>
-          <w:tab w:val="right" w:pos="1400"/>
-        </w:tabs>
-        <w:spacing w:after="20"/>
-      </w:pPr>
-      <w:r>
-        <w:rPr>
-          <w:rFonts w:ascii="Arial" w:cs="Arial" w:eastAsia="Arial" w:hAnsi="Arial"/>
-          <w:color w:val="6F6A62"/>
-          <w:sz w:val="18"/>
-          <w:szCs w:val="18"/>
-        </w:rPr>
-        <w:t xml:space="preserve">5</w:t>
-      </w:r>
-      <w:r>
-        <w:rPr>
-          <w:rFonts w:ascii="Arial" w:cs="Arial" w:eastAsia="Arial" w:hAnsi="Arial"/>
-          <w:b/>
-          <w:bCs/>
-          <w:color w:val="1C1A17"/>
-          <w:sz w:val="18"/>
-          <w:szCs w:val="18"/>
-        </w:rPr>
-        <w:tab/>
-        <w:t xml:space="preserve">Г</w:t>
-      </w:r>
-    </w:p>
-    <w:p>
-      <w:pPr>
-        <w:tabs>
-          <w:tab w:val="right" w:pos="1400"/>
-        </w:tabs>
-        <w:spacing w:after="20"/>
-      </w:pPr>
-      <w:r>
-        <w:rPr>
-          <w:rFonts w:ascii="Arial" w:cs="Arial" w:eastAsia="Arial" w:hAnsi="Arial"/>
-          <w:color w:val="6F6A62"/>
-          <w:sz w:val="18"/>
-          <w:szCs w:val="18"/>
-        </w:rPr>
-        <w:t xml:space="preserve">6</w:t>
-      </w:r>
-      <w:r>
-        <w:rPr>
-          <w:rFonts w:ascii="Arial" w:cs="Arial" w:eastAsia="Arial" w:hAnsi="Arial"/>
-          <w:b/>
-          <w:bCs/>
-          <w:color w:val="1C1A17"/>
-          <w:sz w:val="18"/>
-          <w:szCs w:val="18"/>
-        </w:rPr>
-        <w:tab/>
-        <w:t xml:space="preserve">Г</w:t>
-      </w:r>
-    </w:p>
-    <w:p>
-      <w:pPr>
-        <w:tabs>
-          <w:tab w:val="right" w:pos="1400"/>
-        </w:tabs>
-        <w:spacing w:after="20"/>
-      </w:pPr>
-      <w:r>
-        <w:rPr>
-          <w:rFonts w:ascii="Arial" w:cs="Arial" w:eastAsia="Arial" w:hAnsi="Arial"/>
-          <w:color w:val="6F6A62"/>
-          <w:sz w:val="18"/>
-          <w:szCs w:val="18"/>
-        </w:rPr>
-        <w:t xml:space="preserve">7</w:t>
-      </w:r>
-      <w:r>
-        <w:rPr>
-          <w:rFonts w:ascii="Arial" w:cs="Arial" w:eastAsia="Arial" w:hAnsi="Arial"/>
-          <w:b/>
-          <w:bCs/>
-          <w:color w:val="1C1A17"/>
-          <w:sz w:val="18"/>
-          <w:szCs w:val="18"/>
-        </w:rPr>
-        <w:tab/>
-        <w:t xml:space="preserve">В</w:t>
-      </w:r>
-    </w:p>
-    <w:p>
-      <w:pPr>
-        <w:tabs>
-          <w:tab w:val="right" w:pos="1400"/>
-        </w:tabs>
-        <w:spacing w:after="20"/>
-      </w:pPr>
-      <w:r>
-        <w:rPr>
-          <w:rFonts w:ascii="Arial" w:cs="Arial" w:eastAsia="Arial" w:hAnsi="Arial"/>
-          <w:color w:val="6F6A62"/>
-          <w:sz w:val="18"/>
-          <w:szCs w:val="18"/>
-        </w:rPr>
-        <w:t xml:space="preserve">8</w:t>
-      </w:r>
-      <w:r>
-        <w:rPr>
-          <w:rFonts w:ascii="Arial" w:cs="Arial" w:eastAsia="Arial" w:hAnsi="Arial"/>
-          <w:b/>
-          <w:bCs/>
-          <w:color w:val="1C1A17"/>
-          <w:sz w:val="18"/>
-          <w:szCs w:val="18"/>
-        </w:rPr>
-        <w:tab/>
-        <w:t xml:space="preserve">В</w:t>
-      </w:r>
-    </w:p>
-    <w:p>
-      <w:pPr>
-        <w:tabs>
-          <w:tab w:val="right" w:pos="1400"/>
-        </w:tabs>
-        <w:spacing w:after="20"/>
-      </w:pPr>
-      <w:r>
-        <w:rPr>
-          <w:rFonts w:ascii="Arial" w:cs="Arial" w:eastAsia="Arial" w:hAnsi="Arial"/>
-          <w:color w:val="6F6A62"/>
-          <w:sz w:val="18"/>
-          <w:szCs w:val="18"/>
-        </w:rPr>
-        <w:t xml:space="preserve">9</w:t>
-      </w:r>
-      <w:r>
-        <w:rPr>
-          <w:rFonts w:ascii="Arial" w:cs="Arial" w:eastAsia="Arial" w:hAnsi="Arial"/>
-          <w:b/>
-          <w:bCs/>
-          <w:color w:val="1C1A17"/>
-          <w:sz w:val="18"/>
-          <w:szCs w:val="18"/>
-        </w:rPr>
-        <w:tab/>
-        <w:t xml:space="preserve">В</w:t>
-      </w:r>
-    </w:p>
-    <w:p>
-      <w:pPr>
-        <w:tabs>
-          <w:tab w:val="right" w:pos="1400"/>
-        </w:tabs>
-        <w:spacing w:after="20"/>
-      </w:pPr>
-      <w:r>
-        <w:rPr>
-          <w:rFonts w:ascii="Arial" w:cs="Arial" w:eastAsia="Arial" w:hAnsi="Arial"/>
-          <w:color w:val="6F6A62"/>
-          <w:sz w:val="18"/>
-          <w:szCs w:val="18"/>
-        </w:rPr>
-        <w:t xml:space="preserve">10</w:t>
-      </w:r>
-      <w:r>
-        <w:rPr>
-          <w:rFonts w:ascii="Arial" w:cs="Arial" w:eastAsia="Arial" w:hAnsi="Arial"/>
-          <w:b/>
-          <w:bCs/>
-          <w:color w:val="1C1A17"/>
-          <w:sz w:val="18"/>
-          <w:szCs w:val="18"/>
-        </w:rPr>
-        <w:tab/>
-        <w:t xml:space="preserve">Б</w:t>
-      </w:r>
-    </w:p>
-    <w:p>
-      <w:pPr>
-        <w:tabs>
-          <w:tab w:val="right" w:pos="1400"/>
-        </w:tabs>
-        <w:spacing w:after="20"/>
-      </w:pPr>
-      <w:r>
-        <w:rPr>
-          <w:rFonts w:ascii="Arial" w:cs="Arial" w:eastAsia="Arial" w:hAnsi="Arial"/>
-          <w:color w:val="6F6A62"/>
-          <w:sz w:val="18"/>
-          <w:szCs w:val="18"/>
-        </w:rPr>
-        <w:t xml:space="preserve">11</w:t>
-      </w:r>
-      <w:r>
-        <w:rPr>
-          <w:rFonts w:ascii="Arial" w:cs="Arial" w:eastAsia="Arial" w:hAnsi="Arial"/>
-          <w:b/>
-          <w:bCs/>
-          <w:color w:val="1C1A17"/>
-          <w:sz w:val="18"/>
-          <w:szCs w:val="18"/>
-        </w:rPr>
-        <w:tab/>
-        <w:t xml:space="preserve">А</w:t>
-      </w:r>
-    </w:p>
-    <w:p>
-      <w:pPr>
-        <w:tabs>
-          <w:tab w:val="right" w:pos="1400"/>
-        </w:tabs>
-        <w:spacing w:after="20"/>
-      </w:pPr>
-      <w:r>
-        <w:rPr>
-          <w:rFonts w:ascii="Arial" w:cs="Arial" w:eastAsia="Arial" w:hAnsi="Arial"/>
-          <w:color w:val="6F6A62"/>
-          <w:sz w:val="18"/>
-          <w:szCs w:val="18"/>
-        </w:rPr>
-        <w:t xml:space="preserve">12</w:t>
-      </w:r>
-      <w:r>
-        <w:rPr>
-          <w:rFonts w:ascii="Arial" w:cs="Arial" w:eastAsia="Arial" w:hAnsi="Arial"/>
-          <w:b/>
-          <w:bCs/>
-          <w:color w:val="1C1A17"/>
-          <w:sz w:val="18"/>
-          <w:szCs w:val="18"/>
-        </w:rPr>
-        <w:tab/>
-        <w:t xml:space="preserve">Б</w:t>
-      </w:r>
-    </w:p>
-    <w:p>
-      <w:pPr>
-        <w:tabs>
-          <w:tab w:val="right" w:pos="1400"/>
-        </w:tabs>
-        <w:spacing w:after="20"/>
-      </w:pPr>
-      <w:r>
-        <w:rPr>
-          <w:rFonts w:ascii="Arial" w:cs="Arial" w:eastAsia="Arial" w:hAnsi="Arial"/>
-          <w:color w:val="6F6A62"/>
-          <w:sz w:val="18"/>
-          <w:szCs w:val="18"/>
-        </w:rPr>
-        <w:t xml:space="preserve">13</w:t>
-      </w:r>
-      <w:r>
-        <w:rPr>
-          <w:rFonts w:ascii="Arial" w:cs="Arial" w:eastAsia="Arial" w:hAnsi="Arial"/>
-          <w:b/>
-          <w:bCs/>
-          <w:color w:val="1C1A17"/>
-          <w:sz w:val="18"/>
-          <w:szCs w:val="18"/>
-        </w:rPr>
-        <w:tab/>
-        <w:t xml:space="preserve">А</w:t>
-      </w:r>
-    </w:p>
-    <w:p>
-      <w:pPr>
-        <w:tabs>
-          <w:tab w:val="right" w:pos="1400"/>
-        </w:tabs>
-        <w:spacing w:after="20"/>
-      </w:pPr>
-      <w:r>
-        <w:rPr>
-          <w:rFonts w:ascii="Arial" w:cs="Arial" w:eastAsia="Arial" w:hAnsi="Arial"/>
-          <w:color w:val="6F6A62"/>
-          <w:sz w:val="18"/>
-          <w:szCs w:val="18"/>
-        </w:rPr>
-        <w:t xml:space="preserve">14</w:t>
-      </w:r>
-      <w:r>
-        <w:rPr>
-          <w:rFonts w:ascii="Arial" w:cs="Arial" w:eastAsia="Arial" w:hAnsi="Arial"/>
-          <w:b/>
-          <w:bCs/>
-          <w:color w:val="1C1A17"/>
-          <w:sz w:val="18"/>
-          <w:szCs w:val="18"/>
-        </w:rPr>
-        <w:tab/>
-        <w:t xml:space="preserve">Г</w:t>
-      </w:r>
-    </w:p>
-    <w:p>
-      <w:pPr>
-        <w:tabs>
-          <w:tab w:val="right" w:pos="1400"/>
-        </w:tabs>
-        <w:spacing w:after="20"/>
-      </w:pPr>
-      <w:r>
-        <w:rPr>
-          <w:rFonts w:ascii="Arial" w:cs="Arial" w:eastAsia="Arial" w:hAnsi="Arial"/>
-          <w:color w:val="6F6A62"/>
-          <w:sz w:val="18"/>
-          <w:szCs w:val="18"/>
-        </w:rPr>
-        <w:t xml:space="preserve">15</w:t>
-      </w:r>
-      <w:r>
-        <w:rPr>
-          <w:rFonts w:ascii="Arial" w:cs="Arial" w:eastAsia="Arial" w:hAnsi="Arial"/>
-          <w:b/>
-          <w:bCs/>
-          <w:color w:val="1C1A17"/>
-          <w:sz w:val="18"/>
-          <w:szCs w:val="18"/>
-        </w:rPr>
-        <w:tab/>
-        <w:t xml:space="preserve">В</w:t>
-      </w:r>
-    </w:p>
-    <w:p>
-      <w:pPr>
-        <w:spacing w:before="300"/>
-      </w:pPr>
-      <w:r>
-        <w:rPr>
-          <w:rFonts w:ascii="Arial" w:cs="Arial" w:eastAsia="Arial" w:hAnsi="Arial"/>
-          <w:i/>
-          <w:iCs/>
-          <w:color w:val="6F6A62"/>
-          <w:sz w:val="15"/>
-          <w:szCs w:val="15"/>
-        </w:rPr>
-        <w:t xml:space="preserve">Эту страницу удаляют перед выдачей бланка. Оценка: 13–15 верных ответов — уровень уверенный; 10–12 — база есть, слабые места чаще в этапности работ и инженерии; менее 10 — требуется повторное прохождение блоков «Эргономика», «Этапы проекта» и «Санузлы».</w:t>
       </w:r>
     </w:p>
     <w:sectPr>

</xml_diff>